<commit_message>
Embed actual screenshots (Popup UI, levels, and analytics) inside the SDD Word Document
</commit_message>
<xml_diff>
--- a/Redirect_Shield_AI_Design_Document.docx
+++ b/Redirect_Shield_AI_Design_Document.docx
@@ -3301,13 +3301,53 @@
         <w:jc w:val="center"/>
       </w:pPr>
       <w:r>
+        <w:br/>
+      </w:r>
+      <w:r>
+        <w:drawing>
+          <wp:inline xmlns:a="http://schemas.openxmlformats.org/drawingml/2006/main" xmlns:pic="http://schemas.openxmlformats.org/drawingml/2006/picture">
+            <wp:extent cx="4572000" cy="8516918"/>
+            <wp:docPr id="1" name="Picture 1"/>
+            <wp:cNvGraphicFramePr>
+              <a:graphicFrameLocks noChangeAspect="1"/>
+            </wp:cNvGraphicFramePr>
+            <a:graphic>
+              <a:graphicData uri="http://schemas.openxmlformats.org/drawingml/2006/picture">
+                <pic:pic>
+                  <pic:nvPicPr>
+                    <pic:cNvPr id="0" name="popup_ui.png"/>
+                    <pic:cNvPicPr/>
+                  </pic:nvPicPr>
+                  <pic:blipFill>
+                    <a:blip r:embed="rId9"/>
+                    <a:stretch>
+                      <a:fillRect/>
+                    </a:stretch>
+                  </pic:blipFill>
+                  <pic:spPr>
+                    <a:xfrm>
+                      <a:off x="0" y="0"/>
+                      <a:ext cx="4572000" cy="8516918"/>
+                    </a:xfrm>
+                    <a:prstGeom prst="rect"/>
+                  </pic:spPr>
+                </pic:pic>
+              </a:graphicData>
+            </a:graphic>
+          </wp:inline>
+        </w:drawing>
+      </w:r>
+    </w:p>
+    <w:p>
+      <w:pPr>
+        <w:jc w:val="center"/>
+      </w:pPr>
+      <w:r>
         <w:rPr>
           <w:i/>
-          <w:color w:val="2563EB"/>
+          <w:sz w:val="19"/>
         </w:rPr>
-        <w:br/>
-        <w:t>[Screenshot Placeholder: screenshots/chapter_11_view.png]</w:t>
-        <w:br/>
+        <w:t>Figure 11.1: Actual Screenshot of Popup UI Module</w:t>
       </w:r>
     </w:p>
     <w:tbl>
@@ -3514,13 +3554,53 @@
         <w:jc w:val="center"/>
       </w:pPr>
       <w:r>
+        <w:br/>
+      </w:r>
+      <w:r>
+        <w:drawing>
+          <wp:inline xmlns:a="http://schemas.openxmlformats.org/drawingml/2006/main" xmlns:pic="http://schemas.openxmlformats.org/drawingml/2006/picture">
+            <wp:extent cx="4572000" cy="2147590"/>
+            <wp:docPr id="2" name="Picture 2"/>
+            <wp:cNvGraphicFramePr>
+              <a:graphicFrameLocks noChangeAspect="1"/>
+            </wp:cNvGraphicFramePr>
+            <a:graphic>
+              <a:graphicData uri="http://schemas.openxmlformats.org/drawingml/2006/picture">
+                <pic:pic>
+                  <pic:nvPicPr>
+                    <pic:cNvPr id="0" name="dashboard_levels.png"/>
+                    <pic:cNvPicPr/>
+                  </pic:nvPicPr>
+                  <pic:blipFill>
+                    <a:blip r:embed="rId10"/>
+                    <a:stretch>
+                      <a:fillRect/>
+                    </a:stretch>
+                  </pic:blipFill>
+                  <pic:spPr>
+                    <a:xfrm>
+                      <a:off x="0" y="0"/>
+                      <a:ext cx="4572000" cy="2147590"/>
+                    </a:xfrm>
+                    <a:prstGeom prst="rect"/>
+                  </pic:spPr>
+                </pic:pic>
+              </a:graphicData>
+            </a:graphic>
+          </wp:inline>
+        </w:drawing>
+      </w:r>
+    </w:p>
+    <w:p>
+      <w:pPr>
+        <w:jc w:val="center"/>
+      </w:pPr>
+      <w:r>
         <w:rPr>
           <w:i/>
-          <w:color w:val="2563EB"/>
+          <w:sz w:val="19"/>
         </w:rPr>
-        <w:br/>
-        <w:t>[Screenshot Placeholder: screenshots/chapter_12_view.png]</w:t>
-        <w:br/>
+        <w:t>Figure 12.1: Actual Screenshot of Options Dashboard Panel</w:t>
       </w:r>
     </w:p>
     <w:tbl>
@@ -5298,13 +5378,53 @@
         <w:jc w:val="center"/>
       </w:pPr>
       <w:r>
+        <w:br/>
+      </w:r>
+      <w:r>
+        <w:drawing>
+          <wp:inline xmlns:a="http://schemas.openxmlformats.org/drawingml/2006/main" xmlns:pic="http://schemas.openxmlformats.org/drawingml/2006/picture">
+            <wp:extent cx="4572000" cy="2147590"/>
+            <wp:docPr id="3" name="Picture 3"/>
+            <wp:cNvGraphicFramePr>
+              <a:graphicFrameLocks noChangeAspect="1"/>
+            </wp:cNvGraphicFramePr>
+            <a:graphic>
+              <a:graphicData uri="http://schemas.openxmlformats.org/drawingml/2006/picture">
+                <pic:pic>
+                  <pic:nvPicPr>
+                    <pic:cNvPr id="0" name="dashboard_analytics.png"/>
+                    <pic:cNvPicPr/>
+                  </pic:nvPicPr>
+                  <pic:blipFill>
+                    <a:blip r:embed="rId11"/>
+                    <a:stretch>
+                      <a:fillRect/>
+                    </a:stretch>
+                  </pic:blipFill>
+                  <pic:spPr>
+                    <a:xfrm>
+                      <a:off x="0" y="0"/>
+                      <a:ext cx="4572000" cy="2147590"/>
+                    </a:xfrm>
+                    <a:prstGeom prst="rect"/>
+                  </pic:spPr>
+                </pic:pic>
+              </a:graphicData>
+            </a:graphic>
+          </wp:inline>
+        </w:drawing>
+      </w:r>
+    </w:p>
+    <w:p>
+      <w:pPr>
+        <w:jc w:val="center"/>
+      </w:pPr>
+      <w:r>
         <w:rPr>
           <w:i/>
-          <w:color w:val="2563EB"/>
+          <w:sz w:val="19"/>
         </w:rPr>
-        <w:br/>
-        <w:t>[Screenshot Placeholder: screenshots/chapter_20_view.png]</w:t>
-        <w:br/>
+        <w:t>Figure 20.1: Actual Screenshot of Statistics Aggregator</w:t>
       </w:r>
     </w:p>
     <w:tbl>

</xml_diff>